<commit_message>
Added support to icap for browser commands.
</commit_message>
<xml_diff>
--- a/IdsEditor/Resources/userguide.docx
+++ b/IdsEditor/Resources/userguide.docx
@@ -19,14 +19,243 @@
         <w:spacing w:after="0"/>
         <w:ind w:left="2667"/>
       </w:pPr>
-      <w:r>
-        <w:t xml:space="preserve">&lt;&lt;&lt;&lt;Put the desired help contents here &gt;&gt;&gt;&gt; </w:t>
-      </w:r>
-    </w:p>
-    <w:p>
-      <w:pPr>
-        <w:spacing w:after="0"/>
-        <w:ind w:left="2667"/>
+    </w:p>
+    <w:p>
+      <w:pPr>
+        <w:spacing w:after="0"/>
+        <w:rPr>
+          <w:rFonts w:ascii="Segoe UI" w:hAnsi="Segoe UI" w:cs="Segoe UI"/>
+          <w:color w:val="24292E"/>
+          <w:shd w:val="clear" w:color="auto" w:fill="FFFFFF"/>
+        </w:rPr>
+      </w:pPr>
+      <w:r>
+        <w:rPr>
+          <w:rFonts w:ascii="Segoe UI" w:hAnsi="Segoe UI" w:cs="Segoe UI"/>
+          <w:color w:val="24292E"/>
+          <w:shd w:val="clear" w:color="auto" w:fill="FFFFFF"/>
+        </w:rPr>
+        <w:t>MS-SPEAK</w:t>
+      </w:r>
+      <w:r>
+        <w:rPr>
+          <w:rFonts w:ascii="Segoe UI" w:hAnsi="Segoe UI" w:cs="Segoe UI"/>
+          <w:color w:val="24292E"/>
+          <w:shd w:val="clear" w:color="auto" w:fill="FFFFFF"/>
+        </w:rPr>
+        <w:t xml:space="preserve"> </w:t>
+      </w:r>
+      <w:r>
+        <w:rPr>
+          <w:rFonts w:ascii="Segoe UI" w:hAnsi="Segoe UI" w:cs="Segoe UI"/>
+          <w:color w:val="24292E"/>
+          <w:shd w:val="clear" w:color="auto" w:fill="FFFFFF"/>
+        </w:rPr>
+        <w:t>(</w:t>
+      </w:r>
+      <w:proofErr w:type="spellStart"/>
+      <w:r>
+        <w:rPr>
+          <w:rFonts w:ascii="Segoe UI" w:hAnsi="Segoe UI" w:cs="Segoe UI"/>
+          <w:color w:val="24292E"/>
+          <w:shd w:val="clear" w:color="auto" w:fill="FFFFFF"/>
+        </w:rPr>
+        <w:t>MultiSpeak</w:t>
+      </w:r>
+      <w:proofErr w:type="spellEnd"/>
+      <w:r>
+        <w:rPr>
+          <w:rFonts w:ascii="Segoe UI" w:hAnsi="Segoe UI" w:cs="Segoe UI"/>
+          <w:color w:val="24292E"/>
+          <w:shd w:val="clear" w:color="auto" w:fill="FFFFFF"/>
+        </w:rPr>
+        <w:t xml:space="preserve"> Secure Protocol Enterprise Access Kit) is a collection of software tools that allow for translating (a sub-set of) messages between versions 3, 4 and 5 of the </w:t>
+      </w:r>
+      <w:proofErr w:type="spellStart"/>
+      <w:r>
+        <w:rPr>
+          <w:rFonts w:ascii="Segoe UI" w:hAnsi="Segoe UI" w:cs="Segoe UI"/>
+          <w:color w:val="24292E"/>
+          <w:shd w:val="clear" w:color="auto" w:fill="FFFFFF"/>
+        </w:rPr>
+        <w:t>MultiSpeak</w:t>
+      </w:r>
+      <w:proofErr w:type="spellEnd"/>
+      <w:r>
+        <w:rPr>
+          <w:rFonts w:ascii="Segoe UI" w:hAnsi="Segoe UI" w:cs="Segoe UI"/>
+          <w:color w:val="24292E"/>
+          <w:shd w:val="clear" w:color="auto" w:fill="FFFFFF"/>
+        </w:rPr>
+        <w:t xml:space="preserve"> protocol(</w:t>
+      </w:r>
+      <w:hyperlink r:id="rId5" w:history="1">
+        <w:r>
+          <w:rPr>
+            <w:rStyle w:val="Hyperlink"/>
+            <w:rFonts w:ascii="Segoe UI" w:hAnsi="Segoe UI" w:cs="Segoe UI"/>
+            <w:u w:val="none"/>
+            <w:shd w:val="clear" w:color="auto" w:fill="FFFFFF"/>
+          </w:rPr>
+          <w:t>https://www.multispeak.org/</w:t>
+        </w:r>
+      </w:hyperlink>
+      <w:r>
+        <w:rPr>
+          <w:rFonts w:ascii="Segoe UI" w:hAnsi="Segoe UI" w:cs="Segoe UI"/>
+          <w:color w:val="24292E"/>
+          <w:shd w:val="clear" w:color="auto" w:fill="FFFFFF"/>
+        </w:rPr>
+        <w:t>).</w:t>
+      </w:r>
+      <w:r>
+        <w:rPr>
+          <w:rFonts w:ascii="Segoe UI" w:hAnsi="Segoe UI" w:cs="Segoe UI"/>
+          <w:color w:val="24292E"/>
+          <w:shd w:val="clear" w:color="auto" w:fill="FFFFFF"/>
+        </w:rPr>
+        <w:t xml:space="preserve"> (Phase1)</w:t>
+      </w:r>
+    </w:p>
+    <w:p>
+      <w:pPr>
+        <w:spacing w:after="0"/>
+        <w:rPr>
+          <w:rFonts w:ascii="Segoe UI" w:hAnsi="Segoe UI" w:cs="Segoe UI"/>
+          <w:color w:val="24292E"/>
+          <w:shd w:val="clear" w:color="auto" w:fill="FFFFFF"/>
+        </w:rPr>
+      </w:pPr>
+    </w:p>
+    <w:p>
+      <w:pPr>
+        <w:spacing w:after="0"/>
+        <w:rPr>
+          <w:rFonts w:ascii="Segoe UI" w:hAnsi="Segoe UI" w:cs="Segoe UI"/>
+          <w:color w:val="24292E"/>
+          <w:shd w:val="clear" w:color="auto" w:fill="FFFFFF"/>
+        </w:rPr>
+      </w:pPr>
+      <w:r>
+        <w:rPr>
+          <w:rFonts w:ascii="Segoe UI" w:hAnsi="Segoe UI" w:cs="Segoe UI"/>
+          <w:color w:val="24292E"/>
+          <w:shd w:val="clear" w:color="auto" w:fill="FFFFFF"/>
+        </w:rPr>
+        <w:t>MS-SPEAK</w:t>
+      </w:r>
+      <w:r>
+        <w:rPr>
+          <w:rFonts w:ascii="Segoe UI" w:hAnsi="Segoe UI" w:cs="Segoe UI"/>
+          <w:color w:val="24292E"/>
+          <w:shd w:val="clear" w:color="auto" w:fill="FFFFFF"/>
+        </w:rPr>
+        <w:t xml:space="preserve"> Phase2 and 3</w:t>
+      </w:r>
+      <w:r>
+        <w:rPr>
+          <w:rFonts w:ascii="Segoe UI" w:hAnsi="Segoe UI" w:cs="Segoe UI"/>
+          <w:color w:val="24292E"/>
+          <w:shd w:val="clear" w:color="auto" w:fill="FFFFFF"/>
+        </w:rPr>
+        <w:t xml:space="preserve"> also provides tools to demonstrate cyber security for the remote metering connect/disconnect function in </w:t>
+      </w:r>
+      <w:proofErr w:type="spellStart"/>
+      <w:r>
+        <w:rPr>
+          <w:rFonts w:ascii="Segoe UI" w:hAnsi="Segoe UI" w:cs="Segoe UI"/>
+          <w:color w:val="24292E"/>
+          <w:shd w:val="clear" w:color="auto" w:fill="FFFFFF"/>
+        </w:rPr>
+        <w:t>MultiSpeak</w:t>
+      </w:r>
+      <w:proofErr w:type="spellEnd"/>
+      <w:r>
+        <w:rPr>
+          <w:rFonts w:ascii="Segoe UI" w:hAnsi="Segoe UI" w:cs="Segoe UI"/>
+          <w:color w:val="24292E"/>
+          <w:shd w:val="clear" w:color="auto" w:fill="FFFFFF"/>
+        </w:rPr>
+        <w:t xml:space="preserve">, which should encourage users and vendors to implement cyber security for other </w:t>
+      </w:r>
+      <w:proofErr w:type="spellStart"/>
+      <w:r>
+        <w:rPr>
+          <w:rFonts w:ascii="Segoe UI" w:hAnsi="Segoe UI" w:cs="Segoe UI"/>
+          <w:color w:val="24292E"/>
+          <w:shd w:val="clear" w:color="auto" w:fill="FFFFFF"/>
+        </w:rPr>
+        <w:t>MultiSpeak</w:t>
+      </w:r>
+      <w:proofErr w:type="spellEnd"/>
+      <w:r>
+        <w:rPr>
+          <w:rFonts w:ascii="Segoe UI" w:hAnsi="Segoe UI" w:cs="Segoe UI"/>
+          <w:color w:val="24292E"/>
+          <w:shd w:val="clear" w:color="auto" w:fill="FFFFFF"/>
+        </w:rPr>
+        <w:t xml:space="preserve"> functional interfaces</w:t>
+      </w:r>
+      <w:r>
+        <w:rPr>
+          <w:rFonts w:ascii="Segoe UI" w:hAnsi="Segoe UI" w:cs="Segoe UI"/>
+          <w:color w:val="24292E"/>
+          <w:shd w:val="clear" w:color="auto" w:fill="FFFFFF"/>
+        </w:rPr>
+        <w:t>.</w:t>
+      </w:r>
+    </w:p>
+    <w:p>
+      <w:pPr>
+        <w:spacing w:after="0"/>
+        <w:rPr>
+          <w:rFonts w:ascii="Segoe UI" w:hAnsi="Segoe UI" w:cs="Segoe UI"/>
+          <w:color w:val="24292E"/>
+          <w:shd w:val="clear" w:color="auto" w:fill="FFFFFF"/>
+        </w:rPr>
+      </w:pPr>
+      <w:r>
+        <w:rPr>
+          <w:rFonts w:ascii="Segoe UI" w:hAnsi="Segoe UI" w:cs="Segoe UI"/>
+          <w:color w:val="24292E"/>
+          <w:shd w:val="clear" w:color="auto" w:fill="FFFFFF"/>
+        </w:rPr>
+        <w:t>Business Rule Editor.</w:t>
+      </w:r>
+    </w:p>
+    <w:p>
+      <w:pPr>
+        <w:spacing w:after="0"/>
+        <w:rPr>
+          <w:rFonts w:ascii="Segoe UI" w:hAnsi="Segoe UI" w:cs="Segoe UI"/>
+          <w:color w:val="24292E"/>
+          <w:shd w:val="clear" w:color="auto" w:fill="FFFFFF"/>
+        </w:rPr>
+      </w:pPr>
+    </w:p>
+    <w:p>
+      <w:pPr>
+        <w:spacing w:after="0"/>
+        <w:rPr>
+          <w:rFonts w:ascii="Segoe UI" w:hAnsi="Segoe UI" w:cs="Segoe UI"/>
+          <w:color w:val="24292E"/>
+          <w:shd w:val="clear" w:color="auto" w:fill="FFFFFF"/>
+        </w:rPr>
+      </w:pPr>
+    </w:p>
+    <w:p>
+      <w:pPr>
+        <w:spacing w:after="0"/>
+        <w:rPr>
+          <w:rFonts w:ascii="Segoe UI" w:hAnsi="Segoe UI" w:cs="Segoe UI"/>
+          <w:color w:val="24292E"/>
+          <w:shd w:val="clear" w:color="auto" w:fill="FFFFFF"/>
+        </w:rPr>
+      </w:pPr>
+    </w:p>
+    <w:p>
+      <w:pPr>
+        <w:spacing w:after="0"/>
       </w:pPr>
     </w:p>
     <w:p>
@@ -1032,6 +1261,155 @@
       <w:r>
         <w:t>)</w:t>
       </w:r>
+    </w:p>
+    <w:p>
+      <w:r>
+        <w:br w:type="page"/>
+      </w:r>
+    </w:p>
+    <w:p>
+      <w:pPr>
+        <w:spacing w:after="0"/>
+      </w:pPr>
+    </w:p>
+    <w:p>
+      <w:pPr>
+        <w:spacing w:after="0"/>
+      </w:pPr>
+    </w:p>
+    <w:p>
+      <w:pPr>
+        <w:spacing w:after="0"/>
+        <w:jc w:val="center"/>
+        <w:rPr>
+          <w:sz w:val="28"/>
+          <w:szCs w:val="28"/>
+        </w:rPr>
+      </w:pPr>
+      <w:r>
+        <w:rPr>
+          <w:sz w:val="28"/>
+          <w:szCs w:val="28"/>
+        </w:rPr>
+        <w:t xml:space="preserve">Appendix </w:t>
+      </w:r>
+      <w:r>
+        <w:rPr>
+          <w:sz w:val="28"/>
+          <w:szCs w:val="28"/>
+        </w:rPr>
+        <w:t>B</w:t>
+      </w:r>
+      <w:r>
+        <w:rPr>
+          <w:sz w:val="28"/>
+          <w:szCs w:val="28"/>
+        </w:rPr>
+        <w:t xml:space="preserve"> – </w:t>
+      </w:r>
+      <w:r>
+        <w:rPr>
+          <w:sz w:val="28"/>
+          <w:szCs w:val="28"/>
+        </w:rPr>
+        <w:t>C-ICAP Control</w:t>
+      </w:r>
+    </w:p>
+    <w:p>
+      <w:pPr>
+        <w:spacing w:after="0"/>
+      </w:pPr>
+    </w:p>
+    <w:p>
+      <w:pPr>
+        <w:spacing w:after="0"/>
+      </w:pPr>
+      <w:r>
+        <w:t>The C-</w:t>
+      </w:r>
+      <w:proofErr w:type="spellStart"/>
+      <w:r>
+        <w:t>Icap</w:t>
+      </w:r>
+      <w:proofErr w:type="spellEnd"/>
+      <w:r>
+        <w:t xml:space="preserve"> service can be dynamically controlled via a browser request to the proxy IP specify a ‘</w:t>
+      </w:r>
+      <w:proofErr w:type="spellStart"/>
+      <w:r>
+        <w:t>cmd</w:t>
+      </w:r>
+      <w:proofErr w:type="spellEnd"/>
+      <w:r>
+        <w:t>’ value, i.e.,</w:t>
+      </w:r>
+    </w:p>
+    <w:p>
+      <w:pPr>
+        <w:spacing w:after="0"/>
+        <w:ind w:firstLine="720"/>
+      </w:pPr>
+      <w:hyperlink r:id="rId6" w:history="1">
+        <w:r>
+          <w:rPr>
+            <w:rStyle w:val="Hyperlink"/>
+          </w:rPr>
+          <w:t>http://172.18.77.1:3128/icap?cmd=2</w:t>
+        </w:r>
+      </w:hyperlink>
+    </w:p>
+    <w:p>
+      <w:pPr>
+        <w:spacing w:after="0"/>
+      </w:pPr>
+    </w:p>
+    <w:p>
+      <w:pPr>
+        <w:spacing w:after="0"/>
+      </w:pPr>
+      <w:r>
+        <w:t>Valid values for the ‘</w:t>
+      </w:r>
+      <w:proofErr w:type="spellStart"/>
+      <w:r>
+        <w:t>cmd</w:t>
+      </w:r>
+      <w:proofErr w:type="spellEnd"/>
+      <w:r>
+        <w:t>’ parameter are:</w:t>
+      </w:r>
+    </w:p>
+    <w:p>
+      <w:pPr>
+        <w:spacing w:after="0"/>
+      </w:pPr>
+      <w:r>
+        <w:tab/>
+        <w:t>1:  XXXXXX</w:t>
+      </w:r>
+    </w:p>
+    <w:p>
+      <w:pPr>
+        <w:spacing w:after="0"/>
+      </w:pPr>
+      <w:r>
+        <w:tab/>
+        <w:t>2:  YYYYYY</w:t>
+      </w:r>
+    </w:p>
+    <w:p>
+      <w:pPr>
+        <w:spacing w:after="0"/>
+      </w:pPr>
+      <w:r>
+        <w:tab/>
+        <w:t>3:  ZZZZZZ</w:t>
+      </w:r>
+    </w:p>
+    <w:p>
+      <w:pPr>
+        <w:spacing w:after="0"/>
+      </w:pPr>
     </w:p>
     <w:sectPr>
       <w:pgSz w:w="12240" w:h="15840"/>
@@ -1604,6 +1982,29 @@
       <w:contextualSpacing/>
     </w:pPr>
   </w:style>
+  <w:style w:type="character" w:styleId="Hyperlink">
+    <w:name w:val="Hyperlink"/>
+    <w:basedOn w:val="DefaultParagraphFont"/>
+    <w:uiPriority w:val="99"/>
+    <w:unhideWhenUsed/>
+    <w:rsid w:val="00C51CA8"/>
+    <w:rPr>
+      <w:color w:val="0563C1" w:themeColor="hyperlink"/>
+      <w:u w:val="single"/>
+    </w:rPr>
+  </w:style>
+  <w:style w:type="character" w:styleId="UnresolvedMention">
+    <w:name w:val="Unresolved Mention"/>
+    <w:basedOn w:val="DefaultParagraphFont"/>
+    <w:uiPriority w:val="99"/>
+    <w:semiHidden/>
+    <w:unhideWhenUsed/>
+    <w:rsid w:val="00C51CA8"/>
+    <w:rPr>
+      <w:color w:val="605E5C"/>
+      <w:shd w:val="clear" w:color="auto" w:fill="E1DFDD"/>
+    </w:rPr>
+  </w:style>
 </w:styles>
 </file>
 

</xml_diff>

<commit_message>
Added support to icap for curl commands.
</commit_message>
<xml_diff>
--- a/IdsEditor/Resources/userguide.docx
+++ b/IdsEditor/Resources/userguide.docx
@@ -51,43 +51,7 @@
           <w:color w:val="24292E"/>
           <w:shd w:val="clear" w:color="auto" w:fill="FFFFFF"/>
         </w:rPr>
-        <w:t>(</w:t>
-      </w:r>
-      <w:proofErr w:type="spellStart"/>
-      <w:r>
-        <w:rPr>
-          <w:rFonts w:ascii="Segoe UI" w:hAnsi="Segoe UI" w:cs="Segoe UI"/>
-          <w:color w:val="24292E"/>
-          <w:shd w:val="clear" w:color="auto" w:fill="FFFFFF"/>
-        </w:rPr>
-        <w:t>MultiSpeak</w:t>
-      </w:r>
-      <w:proofErr w:type="spellEnd"/>
-      <w:r>
-        <w:rPr>
-          <w:rFonts w:ascii="Segoe UI" w:hAnsi="Segoe UI" w:cs="Segoe UI"/>
-          <w:color w:val="24292E"/>
-          <w:shd w:val="clear" w:color="auto" w:fill="FFFFFF"/>
-        </w:rPr>
-        <w:t xml:space="preserve"> Secure Protocol Enterprise Access Kit) is a collection of software tools that allow for translating (a sub-set of) messages between versions 3, 4 and 5 of the </w:t>
-      </w:r>
-      <w:proofErr w:type="spellStart"/>
-      <w:r>
-        <w:rPr>
-          <w:rFonts w:ascii="Segoe UI" w:hAnsi="Segoe UI" w:cs="Segoe UI"/>
-          <w:color w:val="24292E"/>
-          <w:shd w:val="clear" w:color="auto" w:fill="FFFFFF"/>
-        </w:rPr>
-        <w:t>MultiSpeak</w:t>
-      </w:r>
-      <w:proofErr w:type="spellEnd"/>
-      <w:r>
-        <w:rPr>
-          <w:rFonts w:ascii="Segoe UI" w:hAnsi="Segoe UI" w:cs="Segoe UI"/>
-          <w:color w:val="24292E"/>
-          <w:shd w:val="clear" w:color="auto" w:fill="FFFFFF"/>
-        </w:rPr>
-        <w:t xml:space="preserve"> protocol(</w:t>
+        <w:t>(MultiSpeak Secure Protocol Enterprise Access Kit) is a collection of software tools that allow for translating (a sub-set of) messages between versions 3, 4 and 5 of the MultiSpeak protocol(</w:t>
       </w:r>
       <w:hyperlink r:id="rId5" w:history="1">
         <w:r>
@@ -158,51 +122,7 @@
           <w:color w:val="24292E"/>
           <w:shd w:val="clear" w:color="auto" w:fill="FFFFFF"/>
         </w:rPr>
-        <w:t xml:space="preserve"> also provides tools to demonstrate cyber security for the remote metering connect/disconnect function in </w:t>
-      </w:r>
-      <w:proofErr w:type="spellStart"/>
-      <w:r>
-        <w:rPr>
-          <w:rFonts w:ascii="Segoe UI" w:hAnsi="Segoe UI" w:cs="Segoe UI"/>
-          <w:color w:val="24292E"/>
-          <w:shd w:val="clear" w:color="auto" w:fill="FFFFFF"/>
-        </w:rPr>
-        <w:t>MultiSpeak</w:t>
-      </w:r>
-      <w:proofErr w:type="spellEnd"/>
-      <w:r>
-        <w:rPr>
-          <w:rFonts w:ascii="Segoe UI" w:hAnsi="Segoe UI" w:cs="Segoe UI"/>
-          <w:color w:val="24292E"/>
-          <w:shd w:val="clear" w:color="auto" w:fill="FFFFFF"/>
-        </w:rPr>
-        <w:t xml:space="preserve">, which should encourage users and vendors to implement cyber security for other </w:t>
-      </w:r>
-      <w:proofErr w:type="spellStart"/>
-      <w:r>
-        <w:rPr>
-          <w:rFonts w:ascii="Segoe UI" w:hAnsi="Segoe UI" w:cs="Segoe UI"/>
-          <w:color w:val="24292E"/>
-          <w:shd w:val="clear" w:color="auto" w:fill="FFFFFF"/>
-        </w:rPr>
-        <w:t>MultiSpeak</w:t>
-      </w:r>
-      <w:proofErr w:type="spellEnd"/>
-      <w:r>
-        <w:rPr>
-          <w:rFonts w:ascii="Segoe UI" w:hAnsi="Segoe UI" w:cs="Segoe UI"/>
-          <w:color w:val="24292E"/>
-          <w:shd w:val="clear" w:color="auto" w:fill="FFFFFF"/>
-        </w:rPr>
-        <w:t xml:space="preserve"> functional interfaces</w:t>
-      </w:r>
-      <w:r>
-        <w:rPr>
-          <w:rFonts w:ascii="Segoe UI" w:hAnsi="Segoe UI" w:cs="Segoe UI"/>
-          <w:color w:val="24292E"/>
-          <w:shd w:val="clear" w:color="auto" w:fill="FFFFFF"/>
-        </w:rPr>
-        <w:t>.</w:t>
+        <w:t xml:space="preserve"> also provides tools to demonstrate cyber security for the remote metering connect/disconnect function in MultiSpeak, which should encourage users and vendors to implement cyber security for other MultiSpeak functional interfaces.</w:t>
       </w:r>
     </w:p>
     <w:p>
@@ -323,36 +243,20 @@
         <w:spacing w:after="0"/>
       </w:pPr>
       <w:r>
-        <w:t>Connect/Disconnect (</w:t>
-      </w:r>
-      <w:proofErr w:type="spellStart"/>
-      <w:r>
-        <w:t>CD_Server</w:t>
-      </w:r>
-      <w:proofErr w:type="spellEnd"/>
-      <w:r>
-        <w:t>)</w:t>
-      </w:r>
-    </w:p>
-    <w:p>
-      <w:pPr>
-        <w:pStyle w:val="ListParagraph"/>
-        <w:numPr>
-          <w:ilvl w:val="0"/>
-          <w:numId w:val="1"/>
-        </w:numPr>
-        <w:spacing w:after="0"/>
-      </w:pPr>
-      <w:r>
-        <w:t>Meter reading (</w:t>
-      </w:r>
-      <w:proofErr w:type="spellStart"/>
-      <w:r>
-        <w:t>MR_Server</w:t>
-      </w:r>
-      <w:proofErr w:type="spellEnd"/>
-      <w:r>
-        <w:t>)</w:t>
+        <w:t>Connect/Disconnect (CD_Server)</w:t>
+      </w:r>
+    </w:p>
+    <w:p>
+      <w:pPr>
+        <w:pStyle w:val="ListParagraph"/>
+        <w:numPr>
+          <w:ilvl w:val="0"/>
+          <w:numId w:val="1"/>
+        </w:numPr>
+        <w:spacing w:after="0"/>
+      </w:pPr>
+      <w:r>
+        <w:t>Meter reading (MR_Server)</w:t>
       </w:r>
     </w:p>
     <w:p>
@@ -390,141 +294,85 @@
         <w:spacing w:after="0"/>
       </w:pPr>
       <w:r>
-        <w:t>Work Requester (</w:t>
-      </w:r>
-      <w:proofErr w:type="spellStart"/>
-      <w:r>
-        <w:t>WR_Server</w:t>
-      </w:r>
-      <w:proofErr w:type="spellEnd"/>
-      <w:r>
-        <w:t>)</w:t>
-      </w:r>
-    </w:p>
-    <w:p>
-      <w:pPr>
-        <w:pStyle w:val="ListParagraph"/>
-        <w:numPr>
-          <w:ilvl w:val="0"/>
-          <w:numId w:val="1"/>
-        </w:numPr>
-        <w:spacing w:after="0"/>
-      </w:pPr>
-      <w:r>
-        <w:t>Work Owner (</w:t>
-      </w:r>
-      <w:proofErr w:type="spellStart"/>
-      <w:r>
-        <w:t>WO_Server</w:t>
-      </w:r>
-      <w:proofErr w:type="spellEnd"/>
-      <w:r>
-        <w:t>).</w:t>
-      </w:r>
-    </w:p>
-    <w:p>
-      <w:pPr>
-        <w:pStyle w:val="ListParagraph"/>
-        <w:numPr>
-          <w:ilvl w:val="0"/>
-          <w:numId w:val="1"/>
-        </w:numPr>
-        <w:spacing w:after="0"/>
-      </w:pPr>
-      <w:r>
-        <w:t>Work Generator (</w:t>
-      </w:r>
-      <w:proofErr w:type="spellStart"/>
-      <w:r>
-        <w:t>WG_Server</w:t>
-      </w:r>
-      <w:proofErr w:type="spellEnd"/>
-      <w:r>
-        <w:t>)</w:t>
-      </w:r>
-    </w:p>
-    <w:p>
-      <w:pPr>
-        <w:pStyle w:val="ListParagraph"/>
-        <w:numPr>
-          <w:ilvl w:val="0"/>
-          <w:numId w:val="1"/>
-        </w:numPr>
-        <w:spacing w:after="0"/>
-      </w:pPr>
-      <w:r>
-        <w:t>Scheduling &amp; Assignment (</w:t>
-      </w:r>
-      <w:proofErr w:type="spellStart"/>
-      <w:r>
-        <w:t>SA_Server</w:t>
-      </w:r>
-      <w:proofErr w:type="spellEnd"/>
-      <w:r>
-        <w:t>)</w:t>
-      </w:r>
-    </w:p>
-    <w:p>
-      <w:pPr>
-        <w:pStyle w:val="ListParagraph"/>
-        <w:numPr>
-          <w:ilvl w:val="0"/>
-          <w:numId w:val="1"/>
-        </w:numPr>
-        <w:spacing w:after="0"/>
-      </w:pPr>
-      <w:r>
-        <w:t>Resource Management (</w:t>
-      </w:r>
-      <w:proofErr w:type="spellStart"/>
-      <w:r>
-        <w:t>RM_Server</w:t>
-      </w:r>
-      <w:proofErr w:type="spellEnd"/>
-      <w:r>
-        <w:t>)</w:t>
-      </w:r>
-    </w:p>
-    <w:p>
-      <w:pPr>
-        <w:pStyle w:val="ListParagraph"/>
-        <w:numPr>
-          <w:ilvl w:val="0"/>
-          <w:numId w:val="1"/>
-        </w:numPr>
-        <w:spacing w:after="0"/>
-      </w:pPr>
-      <w:r>
-        <w:t>Work Performer (</w:t>
-      </w:r>
-      <w:proofErr w:type="spellStart"/>
-      <w:r>
-        <w:t>WP_Server</w:t>
-      </w:r>
-      <w:proofErr w:type="spellEnd"/>
-      <w:r>
-        <w:t>)</w:t>
-      </w:r>
-    </w:p>
-    <w:p>
-      <w:pPr>
-        <w:pStyle w:val="ListParagraph"/>
-        <w:numPr>
-          <w:ilvl w:val="0"/>
-          <w:numId w:val="1"/>
-        </w:numPr>
-        <w:spacing w:after="0"/>
-      </w:pPr>
-      <w:r>
-        <w:t>Work Viewer (</w:t>
-      </w:r>
-      <w:proofErr w:type="spellStart"/>
-      <w:r>
-        <w:t>WV_Server</w:t>
-      </w:r>
-      <w:proofErr w:type="spellEnd"/>
-      <w:r>
-        <w:t>)</w:t>
+        <w:t>Work Requester (WR_Server)</w:t>
+      </w:r>
+    </w:p>
+    <w:p>
+      <w:pPr>
+        <w:pStyle w:val="ListParagraph"/>
+        <w:numPr>
+          <w:ilvl w:val="0"/>
+          <w:numId w:val="1"/>
+        </w:numPr>
+        <w:spacing w:after="0"/>
+      </w:pPr>
+      <w:r>
+        <w:t>Work Owner (WO_Server).</w:t>
+      </w:r>
+    </w:p>
+    <w:p>
+      <w:pPr>
+        <w:pStyle w:val="ListParagraph"/>
+        <w:numPr>
+          <w:ilvl w:val="0"/>
+          <w:numId w:val="1"/>
+        </w:numPr>
+        <w:spacing w:after="0"/>
+      </w:pPr>
+      <w:r>
+        <w:t>Work Generator (WG_Server)</w:t>
+      </w:r>
+    </w:p>
+    <w:p>
+      <w:pPr>
+        <w:pStyle w:val="ListParagraph"/>
+        <w:numPr>
+          <w:ilvl w:val="0"/>
+          <w:numId w:val="1"/>
+        </w:numPr>
+        <w:spacing w:after="0"/>
+      </w:pPr>
+      <w:r>
+        <w:t>Scheduling &amp; Assignment (SA_Server)</w:t>
+      </w:r>
+    </w:p>
+    <w:p>
+      <w:pPr>
+        <w:pStyle w:val="ListParagraph"/>
+        <w:numPr>
+          <w:ilvl w:val="0"/>
+          <w:numId w:val="1"/>
+        </w:numPr>
+        <w:spacing w:after="0"/>
+      </w:pPr>
+      <w:r>
+        <w:t>Resource Management (RM_Server)</w:t>
+      </w:r>
+    </w:p>
+    <w:p>
+      <w:pPr>
+        <w:pStyle w:val="ListParagraph"/>
+        <w:numPr>
+          <w:ilvl w:val="0"/>
+          <w:numId w:val="1"/>
+        </w:numPr>
+        <w:spacing w:after="0"/>
+      </w:pPr>
+      <w:r>
+        <w:t>Work Performer (WP_Server)</w:t>
+      </w:r>
+    </w:p>
+    <w:p>
+      <w:pPr>
+        <w:pStyle w:val="ListParagraph"/>
+        <w:numPr>
+          <w:ilvl w:val="0"/>
+          <w:numId w:val="1"/>
+        </w:numPr>
+        <w:spacing w:after="0"/>
+      </w:pPr>
+      <w:r>
+        <w:t>Work Viewer (WV_Server)</w:t>
       </w:r>
     </w:p>
     <w:p>
@@ -562,78 +410,46 @@
         <w:spacing w:after="0"/>
       </w:pPr>
       <w:r>
-        <w:t>Assembly Management (</w:t>
-      </w:r>
-      <w:proofErr w:type="spellStart"/>
-      <w:r>
-        <w:t>ASM_Server</w:t>
-      </w:r>
-      <w:proofErr w:type="spellEnd"/>
-      <w:r>
-        <w:t>)</w:t>
-      </w:r>
-    </w:p>
-    <w:p>
-      <w:pPr>
-        <w:pStyle w:val="ListParagraph"/>
-        <w:numPr>
-          <w:ilvl w:val="0"/>
-          <w:numId w:val="1"/>
-        </w:numPr>
-        <w:spacing w:after="0"/>
-      </w:pPr>
-      <w:r>
-        <w:t>Finance and Accounting (</w:t>
-      </w:r>
-      <w:proofErr w:type="spellStart"/>
-      <w:r>
-        <w:t>FA_Server</w:t>
-      </w:r>
-      <w:proofErr w:type="spellEnd"/>
-      <w:r>
-        <w:t>)</w:t>
-      </w:r>
-    </w:p>
-    <w:p>
-      <w:pPr>
-        <w:pStyle w:val="ListParagraph"/>
-        <w:numPr>
-          <w:ilvl w:val="0"/>
-          <w:numId w:val="1"/>
-        </w:numPr>
-        <w:spacing w:after="0"/>
-      </w:pPr>
-      <w:r>
-        <w:t>Inventory Management (</w:t>
-      </w:r>
-      <w:proofErr w:type="spellStart"/>
-      <w:r>
-        <w:t>INV_Server</w:t>
-      </w:r>
-      <w:proofErr w:type="spellEnd"/>
-      <w:r>
-        <w:t>)</w:t>
-      </w:r>
-    </w:p>
-    <w:p>
-      <w:pPr>
-        <w:pStyle w:val="ListParagraph"/>
-        <w:numPr>
-          <w:ilvl w:val="0"/>
-          <w:numId w:val="1"/>
-        </w:numPr>
-        <w:spacing w:after="0"/>
-      </w:pPr>
-      <w:r>
-        <w:t>End Device Testing and Receiving (</w:t>
-      </w:r>
-      <w:proofErr w:type="spellStart"/>
-      <w:r>
-        <w:t>EDTR_Server</w:t>
-      </w:r>
-      <w:proofErr w:type="spellEnd"/>
-      <w:r>
-        <w:t>)</w:t>
+        <w:t>Assembly Management (ASM_Server)</w:t>
+      </w:r>
+    </w:p>
+    <w:p>
+      <w:pPr>
+        <w:pStyle w:val="ListParagraph"/>
+        <w:numPr>
+          <w:ilvl w:val="0"/>
+          <w:numId w:val="1"/>
+        </w:numPr>
+        <w:spacing w:after="0"/>
+      </w:pPr>
+      <w:r>
+        <w:t>Finance and Accounting (FA_Server)</w:t>
+      </w:r>
+    </w:p>
+    <w:p>
+      <w:pPr>
+        <w:pStyle w:val="ListParagraph"/>
+        <w:numPr>
+          <w:ilvl w:val="0"/>
+          <w:numId w:val="1"/>
+        </w:numPr>
+        <w:spacing w:after="0"/>
+      </w:pPr>
+      <w:r>
+        <w:t>Inventory Management (INV_Server)</w:t>
+      </w:r>
+    </w:p>
+    <w:p>
+      <w:pPr>
+        <w:pStyle w:val="ListParagraph"/>
+        <w:numPr>
+          <w:ilvl w:val="0"/>
+          <w:numId w:val="1"/>
+        </w:numPr>
+        <w:spacing w:after="0"/>
+      </w:pPr>
+      <w:r>
+        <w:t>End Device Testing and Receiving (EDTR_Server)</w:t>
       </w:r>
     </w:p>
     <w:p>
@@ -671,120 +487,72 @@
         <w:spacing w:after="0"/>
       </w:pPr>
       <w:r>
-        <w:t>Customer Billing (</w:t>
-      </w:r>
-      <w:proofErr w:type="spellStart"/>
-      <w:r>
-        <w:t>CB_Server</w:t>
-      </w:r>
-      <w:proofErr w:type="spellEnd"/>
-      <w:r>
-        <w:t>)</w:t>
-      </w:r>
-    </w:p>
-    <w:p>
-      <w:pPr>
-        <w:pStyle w:val="ListParagraph"/>
-        <w:numPr>
-          <w:ilvl w:val="0"/>
-          <w:numId w:val="1"/>
-        </w:numPr>
-        <w:spacing w:after="0"/>
-      </w:pPr>
-      <w:r>
-        <w:t>Prepaid Metering (</w:t>
-      </w:r>
-      <w:proofErr w:type="spellStart"/>
-      <w:r>
-        <w:t>PPM_Server</w:t>
-      </w:r>
-      <w:proofErr w:type="spellEnd"/>
-      <w:r>
-        <w:t>)</w:t>
-      </w:r>
-    </w:p>
-    <w:p>
-      <w:pPr>
-        <w:pStyle w:val="ListParagraph"/>
-        <w:numPr>
-          <w:ilvl w:val="0"/>
-          <w:numId w:val="1"/>
-        </w:numPr>
-        <w:spacing w:after="0"/>
-      </w:pPr>
-      <w:r>
-        <w:t>Commissioning and Provisioning (</w:t>
-      </w:r>
-      <w:proofErr w:type="spellStart"/>
-      <w:r>
-        <w:t>CP_Server</w:t>
-      </w:r>
-      <w:proofErr w:type="spellEnd"/>
-      <w:r>
-        <w:t>)</w:t>
-      </w:r>
-    </w:p>
-    <w:p>
-      <w:pPr>
-        <w:pStyle w:val="ListParagraph"/>
-        <w:numPr>
-          <w:ilvl w:val="0"/>
-          <w:numId w:val="1"/>
-        </w:numPr>
-        <w:spacing w:after="0"/>
-      </w:pPr>
-      <w:r>
-        <w:t>Meter Data Management (</w:t>
-      </w:r>
-      <w:proofErr w:type="spellStart"/>
-      <w:r>
-        <w:t>MDM_Server</w:t>
-      </w:r>
-      <w:proofErr w:type="spellEnd"/>
-      <w:r>
-        <w:t>)</w:t>
-      </w:r>
-    </w:p>
-    <w:p>
-      <w:pPr>
-        <w:pStyle w:val="ListParagraph"/>
-        <w:numPr>
-          <w:ilvl w:val="0"/>
-          <w:numId w:val="1"/>
-        </w:numPr>
-        <w:spacing w:after="0"/>
-      </w:pPr>
-      <w:r>
-        <w:t>Payment Processing (</w:t>
-      </w:r>
-      <w:proofErr w:type="spellStart"/>
-      <w:r>
-        <w:t>PP_Server</w:t>
-      </w:r>
-      <w:proofErr w:type="spellEnd"/>
-      <w:r>
-        <w:t>)</w:t>
-      </w:r>
-    </w:p>
-    <w:p>
-      <w:pPr>
-        <w:pStyle w:val="ListParagraph"/>
-        <w:numPr>
-          <w:ilvl w:val="0"/>
-          <w:numId w:val="1"/>
-        </w:numPr>
-        <w:spacing w:after="0"/>
-      </w:pPr>
-      <w:r>
-        <w:t>Payment Gateway (</w:t>
-      </w:r>
-      <w:proofErr w:type="spellStart"/>
-      <w:r>
-        <w:t>PG_Server</w:t>
-      </w:r>
-      <w:proofErr w:type="spellEnd"/>
-      <w:r>
-        <w:t>)</w:t>
+        <w:t>Customer Billing (CB_Server)</w:t>
+      </w:r>
+    </w:p>
+    <w:p>
+      <w:pPr>
+        <w:pStyle w:val="ListParagraph"/>
+        <w:numPr>
+          <w:ilvl w:val="0"/>
+          <w:numId w:val="1"/>
+        </w:numPr>
+        <w:spacing w:after="0"/>
+      </w:pPr>
+      <w:r>
+        <w:t>Prepaid Metering (PPM_Server)</w:t>
+      </w:r>
+    </w:p>
+    <w:p>
+      <w:pPr>
+        <w:pStyle w:val="ListParagraph"/>
+        <w:numPr>
+          <w:ilvl w:val="0"/>
+          <w:numId w:val="1"/>
+        </w:numPr>
+        <w:spacing w:after="0"/>
+      </w:pPr>
+      <w:r>
+        <w:t>Commissioning and Provisioning (CP_Server)</w:t>
+      </w:r>
+    </w:p>
+    <w:p>
+      <w:pPr>
+        <w:pStyle w:val="ListParagraph"/>
+        <w:numPr>
+          <w:ilvl w:val="0"/>
+          <w:numId w:val="1"/>
+        </w:numPr>
+        <w:spacing w:after="0"/>
+      </w:pPr>
+      <w:r>
+        <w:t>Meter Data Management (MDM_Server)</w:t>
+      </w:r>
+    </w:p>
+    <w:p>
+      <w:pPr>
+        <w:pStyle w:val="ListParagraph"/>
+        <w:numPr>
+          <w:ilvl w:val="0"/>
+          <w:numId w:val="1"/>
+        </w:numPr>
+        <w:spacing w:after="0"/>
+      </w:pPr>
+      <w:r>
+        <w:t>Payment Processing (PP_Server)</w:t>
+      </w:r>
+    </w:p>
+    <w:p>
+      <w:pPr>
+        <w:pStyle w:val="ListParagraph"/>
+        <w:numPr>
+          <w:ilvl w:val="0"/>
+          <w:numId w:val="1"/>
+        </w:numPr>
+        <w:spacing w:after="0"/>
+      </w:pPr>
+      <w:r>
+        <w:t>Payment Gateway (PG_Server)</w:t>
       </w:r>
     </w:p>
     <w:p>
@@ -822,120 +590,72 @@
         <w:spacing w:after="0"/>
       </w:pPr>
       <w:r>
-        <w:t>Asset management (</w:t>
-      </w:r>
-      <w:proofErr w:type="spellStart"/>
-      <w:r>
-        <w:t>AM_Server</w:t>
-      </w:r>
-      <w:proofErr w:type="spellEnd"/>
-      <w:r>
-        <w:t>)</w:t>
-      </w:r>
-    </w:p>
-    <w:p>
-      <w:pPr>
-        <w:pStyle w:val="ListParagraph"/>
-        <w:numPr>
-          <w:ilvl w:val="0"/>
-          <w:numId w:val="1"/>
-        </w:numPr>
-        <w:spacing w:after="0"/>
-      </w:pPr>
-      <w:r>
-        <w:t>Field Design (</w:t>
-      </w:r>
-      <w:proofErr w:type="spellStart"/>
-      <w:r>
-        <w:t>DGN_Server</w:t>
-      </w:r>
-      <w:proofErr w:type="spellEnd"/>
-      <w:r>
-        <w:t>)</w:t>
-      </w:r>
-    </w:p>
-    <w:p>
-      <w:pPr>
-        <w:pStyle w:val="ListParagraph"/>
-        <w:numPr>
-          <w:ilvl w:val="0"/>
-          <w:numId w:val="1"/>
-        </w:numPr>
-        <w:spacing w:after="0"/>
-      </w:pPr>
-      <w:r>
-        <w:t>Engineering Analysis (</w:t>
-      </w:r>
-      <w:proofErr w:type="spellStart"/>
-      <w:r>
-        <w:t>EA_Server</w:t>
-      </w:r>
-      <w:proofErr w:type="spellEnd"/>
-      <w:r>
-        <w:t>)</w:t>
-      </w:r>
-    </w:p>
-    <w:p>
-      <w:pPr>
-        <w:pStyle w:val="ListParagraph"/>
-        <w:numPr>
-          <w:ilvl w:val="0"/>
-          <w:numId w:val="1"/>
-        </w:numPr>
-        <w:spacing w:after="0"/>
-      </w:pPr>
-      <w:r>
-        <w:t>Network Model Management (</w:t>
-      </w:r>
-      <w:proofErr w:type="spellStart"/>
-      <w:r>
-        <w:t>MOD_Server</w:t>
-      </w:r>
-      <w:proofErr w:type="spellEnd"/>
-      <w:r>
-        <w:t>)</w:t>
-      </w:r>
-    </w:p>
-    <w:p>
-      <w:pPr>
-        <w:pStyle w:val="ListParagraph"/>
-        <w:numPr>
-          <w:ilvl w:val="0"/>
-          <w:numId w:val="1"/>
-        </w:numPr>
-        <w:spacing w:after="0"/>
-      </w:pPr>
-      <w:r>
-        <w:t>Geographic Information System (</w:t>
-      </w:r>
-      <w:proofErr w:type="spellStart"/>
-      <w:r>
-        <w:t>GIS_Server</w:t>
-      </w:r>
-      <w:proofErr w:type="spellEnd"/>
-      <w:r>
-        <w:t>)</w:t>
-      </w:r>
-    </w:p>
-    <w:p>
-      <w:pPr>
-        <w:pStyle w:val="ListParagraph"/>
-        <w:numPr>
-          <w:ilvl w:val="0"/>
-          <w:numId w:val="1"/>
-        </w:numPr>
-        <w:spacing w:after="0"/>
-      </w:pPr>
-      <w:r>
-        <w:t>Underground Facility Location (</w:t>
-      </w:r>
-      <w:proofErr w:type="spellStart"/>
-      <w:r>
-        <w:t>LOC_Server</w:t>
-      </w:r>
-      <w:proofErr w:type="spellEnd"/>
-      <w:r>
-        <w:t>)</w:t>
+        <w:t>Asset management (AM_Server)</w:t>
+      </w:r>
+    </w:p>
+    <w:p>
+      <w:pPr>
+        <w:pStyle w:val="ListParagraph"/>
+        <w:numPr>
+          <w:ilvl w:val="0"/>
+          <w:numId w:val="1"/>
+        </w:numPr>
+        <w:spacing w:after="0"/>
+      </w:pPr>
+      <w:r>
+        <w:t>Field Design (DGN_Server)</w:t>
+      </w:r>
+    </w:p>
+    <w:p>
+      <w:pPr>
+        <w:pStyle w:val="ListParagraph"/>
+        <w:numPr>
+          <w:ilvl w:val="0"/>
+          <w:numId w:val="1"/>
+        </w:numPr>
+        <w:spacing w:after="0"/>
+      </w:pPr>
+      <w:r>
+        <w:t>Engineering Analysis (EA_Server)</w:t>
+      </w:r>
+    </w:p>
+    <w:p>
+      <w:pPr>
+        <w:pStyle w:val="ListParagraph"/>
+        <w:numPr>
+          <w:ilvl w:val="0"/>
+          <w:numId w:val="1"/>
+        </w:numPr>
+        <w:spacing w:after="0"/>
+      </w:pPr>
+      <w:r>
+        <w:t>Network Model Management (MOD_Server)</w:t>
+      </w:r>
+    </w:p>
+    <w:p>
+      <w:pPr>
+        <w:pStyle w:val="ListParagraph"/>
+        <w:numPr>
+          <w:ilvl w:val="0"/>
+          <w:numId w:val="1"/>
+        </w:numPr>
+        <w:spacing w:after="0"/>
+      </w:pPr>
+      <w:r>
+        <w:t>Geographic Information System (GIS_Server)</w:t>
+      </w:r>
+    </w:p>
+    <w:p>
+      <w:pPr>
+        <w:pStyle w:val="ListParagraph"/>
+        <w:numPr>
+          <w:ilvl w:val="0"/>
+          <w:numId w:val="1"/>
+        </w:numPr>
+        <w:spacing w:after="0"/>
+      </w:pPr>
+      <w:r>
+        <w:t>Underground Facility Location (LOC_Server)</w:t>
       </w:r>
     </w:p>
     <w:p>
@@ -973,99 +693,59 @@
         <w:spacing w:after="0"/>
       </w:pPr>
       <w:r>
-        <w:t>Demand Management (</w:t>
-      </w:r>
-      <w:proofErr w:type="spellStart"/>
-      <w:r>
-        <w:t>DM_Server</w:t>
-      </w:r>
-      <w:proofErr w:type="spellEnd"/>
-      <w:r>
-        <w:t>)</w:t>
-      </w:r>
-    </w:p>
-    <w:p>
-      <w:pPr>
-        <w:pStyle w:val="ListParagraph"/>
-        <w:numPr>
-          <w:ilvl w:val="0"/>
-          <w:numId w:val="1"/>
-        </w:numPr>
-        <w:spacing w:after="0"/>
-      </w:pPr>
-      <w:r>
-        <w:t>Demand Response (</w:t>
-      </w:r>
-      <w:proofErr w:type="spellStart"/>
-      <w:r>
-        <w:t>DR_Server</w:t>
-      </w:r>
-      <w:proofErr w:type="spellEnd"/>
-      <w:r>
-        <w:t>)</w:t>
-      </w:r>
-    </w:p>
-    <w:p>
-      <w:pPr>
-        <w:pStyle w:val="ListParagraph"/>
-        <w:numPr>
-          <w:ilvl w:val="0"/>
-          <w:numId w:val="1"/>
-        </w:numPr>
-        <w:spacing w:after="0"/>
-      </w:pPr>
-      <w:r>
-        <w:t>Message Management (</w:t>
-      </w:r>
-      <w:proofErr w:type="spellStart"/>
-      <w:r>
-        <w:t>MM_Server</w:t>
-      </w:r>
-      <w:proofErr w:type="spellEnd"/>
-      <w:r>
-        <w:t>)</w:t>
-      </w:r>
-    </w:p>
-    <w:p>
-      <w:pPr>
-        <w:pStyle w:val="ListParagraph"/>
-        <w:numPr>
-          <w:ilvl w:val="0"/>
-          <w:numId w:val="1"/>
-        </w:numPr>
-        <w:spacing w:after="0"/>
-      </w:pPr>
-      <w:r>
-        <w:t>PAN Communications (</w:t>
-      </w:r>
-      <w:proofErr w:type="spellStart"/>
-      <w:r>
-        <w:t>PAN_Server</w:t>
-      </w:r>
-      <w:proofErr w:type="spellEnd"/>
-      <w:r>
-        <w:t>)</w:t>
-      </w:r>
-    </w:p>
-    <w:p>
-      <w:pPr>
-        <w:pStyle w:val="ListParagraph"/>
-        <w:numPr>
-          <w:ilvl w:val="0"/>
-          <w:numId w:val="1"/>
-        </w:numPr>
-        <w:spacing w:after="0"/>
-      </w:pPr>
-      <w:r>
-        <w:t>Distributed Energy Resources (</w:t>
-      </w:r>
-      <w:proofErr w:type="spellStart"/>
-      <w:r>
-        <w:t>DER_Server</w:t>
-      </w:r>
-      <w:proofErr w:type="spellEnd"/>
-      <w:r>
-        <w:t>)</w:t>
+        <w:t>Demand Management (DM_Server)</w:t>
+      </w:r>
+    </w:p>
+    <w:p>
+      <w:pPr>
+        <w:pStyle w:val="ListParagraph"/>
+        <w:numPr>
+          <w:ilvl w:val="0"/>
+          <w:numId w:val="1"/>
+        </w:numPr>
+        <w:spacing w:after="0"/>
+      </w:pPr>
+      <w:r>
+        <w:t>Demand Response (DR_Server)</w:t>
+      </w:r>
+    </w:p>
+    <w:p>
+      <w:pPr>
+        <w:pStyle w:val="ListParagraph"/>
+        <w:numPr>
+          <w:ilvl w:val="0"/>
+          <w:numId w:val="1"/>
+        </w:numPr>
+        <w:spacing w:after="0"/>
+      </w:pPr>
+      <w:r>
+        <w:t>Message Management (MM_Server)</w:t>
+      </w:r>
+    </w:p>
+    <w:p>
+      <w:pPr>
+        <w:pStyle w:val="ListParagraph"/>
+        <w:numPr>
+          <w:ilvl w:val="0"/>
+          <w:numId w:val="1"/>
+        </w:numPr>
+        <w:spacing w:after="0"/>
+      </w:pPr>
+      <w:r>
+        <w:t>PAN Communications (PAN_Server)</w:t>
+      </w:r>
+    </w:p>
+    <w:p>
+      <w:pPr>
+        <w:pStyle w:val="ListParagraph"/>
+        <w:numPr>
+          <w:ilvl w:val="0"/>
+          <w:numId w:val="1"/>
+        </w:numPr>
+        <w:spacing w:after="0"/>
+      </w:pPr>
+      <w:r>
+        <w:t>Distributed Energy Resources (DER_Server)</w:t>
       </w:r>
     </w:p>
     <w:p>
@@ -1103,57 +783,33 @@
         <w:spacing w:after="0"/>
       </w:pPr>
       <w:r>
-        <w:t>Call Handling (</w:t>
-      </w:r>
-      <w:proofErr w:type="spellStart"/>
-      <w:r>
-        <w:t>CH_Server</w:t>
-      </w:r>
-      <w:proofErr w:type="spellEnd"/>
-      <w:r>
-        <w:t>)</w:t>
-      </w:r>
-    </w:p>
-    <w:p>
-      <w:pPr>
-        <w:pStyle w:val="ListParagraph"/>
-        <w:numPr>
-          <w:ilvl w:val="0"/>
-          <w:numId w:val="1"/>
-        </w:numPr>
-        <w:spacing w:after="0"/>
-      </w:pPr>
-      <w:r>
-        <w:t>Outage Detection (</w:t>
-      </w:r>
-      <w:proofErr w:type="spellStart"/>
-      <w:r>
-        <w:t>OD_Server</w:t>
-      </w:r>
-      <w:proofErr w:type="spellEnd"/>
-      <w:r>
-        <w:t>)</w:t>
-      </w:r>
-    </w:p>
-    <w:p>
-      <w:pPr>
-        <w:pStyle w:val="ListParagraph"/>
-        <w:numPr>
-          <w:ilvl w:val="0"/>
-          <w:numId w:val="1"/>
-        </w:numPr>
-        <w:spacing w:after="0"/>
-      </w:pPr>
-      <w:r>
-        <w:t>Outage Analysis (</w:t>
-      </w:r>
-      <w:proofErr w:type="spellStart"/>
-      <w:r>
-        <w:t>OA_Server</w:t>
-      </w:r>
-      <w:proofErr w:type="spellEnd"/>
-      <w:r>
-        <w:t>)</w:t>
+        <w:t>Call Handling (CH_Server)</w:t>
+      </w:r>
+    </w:p>
+    <w:p>
+      <w:pPr>
+        <w:pStyle w:val="ListParagraph"/>
+        <w:numPr>
+          <w:ilvl w:val="0"/>
+          <w:numId w:val="1"/>
+        </w:numPr>
+        <w:spacing w:after="0"/>
+      </w:pPr>
+      <w:r>
+        <w:t>Outage Detection (OD_Server)</w:t>
+      </w:r>
+    </w:p>
+    <w:p>
+      <w:pPr>
+        <w:pStyle w:val="ListParagraph"/>
+        <w:numPr>
+          <w:ilvl w:val="0"/>
+          <w:numId w:val="1"/>
+        </w:numPr>
+        <w:spacing w:after="0"/>
+      </w:pPr>
+      <w:r>
+        <w:t>Outage Analysis (OA_Server)</w:t>
       </w:r>
     </w:p>
     <w:p>
@@ -1167,99 +823,59 @@
       </w:pPr>
       <w:r>
         <w:lastRenderedPageBreak/>
-        <w:t>Distribution Automation (</w:t>
-      </w:r>
-      <w:proofErr w:type="spellStart"/>
-      <w:r>
-        <w:t>DA_Server</w:t>
-      </w:r>
-      <w:proofErr w:type="spellEnd"/>
-      <w:r>
-        <w:t>)</w:t>
-      </w:r>
-    </w:p>
-    <w:p>
-      <w:pPr>
-        <w:pStyle w:val="ListParagraph"/>
-        <w:numPr>
-          <w:ilvl w:val="0"/>
-          <w:numId w:val="1"/>
-        </w:numPr>
-        <w:spacing w:after="0"/>
-      </w:pPr>
-      <w:r>
-        <w:t>Supervisory Control and Data Acquisition (</w:t>
-      </w:r>
-      <w:proofErr w:type="spellStart"/>
-      <w:r>
-        <w:t>SCADA_Server</w:t>
-      </w:r>
-      <w:proofErr w:type="spellEnd"/>
-      <w:r>
-        <w:t>)</w:t>
-      </w:r>
-    </w:p>
-    <w:p>
-      <w:pPr>
-        <w:pStyle w:val="ListParagraph"/>
-        <w:numPr>
-          <w:ilvl w:val="0"/>
-          <w:numId w:val="1"/>
-        </w:numPr>
-        <w:spacing w:after="0"/>
-      </w:pPr>
-      <w:r>
-        <w:t>Switching Orders (</w:t>
-      </w:r>
-      <w:proofErr w:type="spellStart"/>
-      <w:r>
-        <w:t>SWO_Server</w:t>
-      </w:r>
-      <w:proofErr w:type="spellEnd"/>
-      <w:r>
-        <w:t>)</w:t>
-      </w:r>
-    </w:p>
-    <w:p>
-      <w:pPr>
-        <w:pStyle w:val="ListParagraph"/>
-        <w:numPr>
-          <w:ilvl w:val="0"/>
-          <w:numId w:val="1"/>
-        </w:numPr>
-        <w:spacing w:after="0"/>
-      </w:pPr>
-      <w:r>
-        <w:t>Location Tracking (</w:t>
-      </w:r>
-      <w:proofErr w:type="spellStart"/>
-      <w:r>
-        <w:t>LT_Server</w:t>
-      </w:r>
-      <w:proofErr w:type="spellEnd"/>
-      <w:r>
-        <w:t>)</w:t>
-      </w:r>
-    </w:p>
-    <w:p>
-      <w:pPr>
-        <w:pStyle w:val="ListParagraph"/>
-        <w:numPr>
-          <w:ilvl w:val="0"/>
-          <w:numId w:val="1"/>
-        </w:numPr>
-        <w:spacing w:after="0"/>
-      </w:pPr>
-      <w:r>
-        <w:t>Weather (</w:t>
-      </w:r>
-      <w:proofErr w:type="spellStart"/>
-      <w:r>
-        <w:t>WEA_Server</w:t>
-      </w:r>
-      <w:proofErr w:type="spellEnd"/>
-      <w:r>
-        <w:t>)</w:t>
+        <w:t>Distribution Automation (DA_Server)</w:t>
+      </w:r>
+    </w:p>
+    <w:p>
+      <w:pPr>
+        <w:pStyle w:val="ListParagraph"/>
+        <w:numPr>
+          <w:ilvl w:val="0"/>
+          <w:numId w:val="1"/>
+        </w:numPr>
+        <w:spacing w:after="0"/>
+      </w:pPr>
+      <w:r>
+        <w:t>Supervisory Control and Data Acquisition (SCADA_Server)</w:t>
+      </w:r>
+    </w:p>
+    <w:p>
+      <w:pPr>
+        <w:pStyle w:val="ListParagraph"/>
+        <w:numPr>
+          <w:ilvl w:val="0"/>
+          <w:numId w:val="1"/>
+        </w:numPr>
+        <w:spacing w:after="0"/>
+      </w:pPr>
+      <w:r>
+        <w:t>Switching Orders (SWO_Server)</w:t>
+      </w:r>
+    </w:p>
+    <w:p>
+      <w:pPr>
+        <w:pStyle w:val="ListParagraph"/>
+        <w:numPr>
+          <w:ilvl w:val="0"/>
+          <w:numId w:val="1"/>
+        </w:numPr>
+        <w:spacing w:after="0"/>
+      </w:pPr>
+      <w:r>
+        <w:t>Location Tracking (LT_Server)</w:t>
+      </w:r>
+    </w:p>
+    <w:p>
+      <w:pPr>
+        <w:pStyle w:val="ListParagraph"/>
+        <w:numPr>
+          <w:ilvl w:val="0"/>
+          <w:numId w:val="1"/>
+        </w:numPr>
+        <w:spacing w:after="0"/>
+      </w:pPr>
+      <w:r>
+        <w:t>Weather (WEA_Server)</w:t>
       </w:r>
     </w:p>
     <w:p>
@@ -1325,23 +941,7 @@
         <w:spacing w:after="0"/>
       </w:pPr>
       <w:r>
-        <w:t>The C-</w:t>
-      </w:r>
-      <w:proofErr w:type="spellStart"/>
-      <w:r>
-        <w:t>Icap</w:t>
-      </w:r>
-      <w:proofErr w:type="spellEnd"/>
-      <w:r>
-        <w:t xml:space="preserve"> service can be dynamically controlled via a browser request to the proxy IP specify a ‘</w:t>
-      </w:r>
-      <w:proofErr w:type="spellStart"/>
-      <w:r>
-        <w:t>cmd</w:t>
-      </w:r>
-      <w:proofErr w:type="spellEnd"/>
-      <w:r>
-        <w:t>’ value, i.e.,</w:t>
+        <w:t>The C-Icap service can be dynamically controlled via a browser request to the proxy IP specify a ‘cmd’ value, i.e.,</w:t>
       </w:r>
     </w:p>
     <w:p>
@@ -1368,15 +968,7 @@
         <w:spacing w:after="0"/>
       </w:pPr>
       <w:r>
-        <w:t>Valid values for the ‘</w:t>
-      </w:r>
-      <w:proofErr w:type="spellStart"/>
-      <w:r>
-        <w:t>cmd</w:t>
-      </w:r>
-      <w:proofErr w:type="spellEnd"/>
-      <w:r>
-        <w:t>’ parameter are:</w:t>
+        <w:t>Valid values for the ‘cmd’ parameter are:</w:t>
       </w:r>
     </w:p>
     <w:p>
@@ -1411,9 +1003,90 @@
         <w:spacing w:after="0"/>
       </w:pPr>
     </w:p>
+    <w:p>
+      <w:pPr>
+        <w:spacing w:after="0"/>
+      </w:pPr>
+      <w:r>
+        <w:t>Commands can also be sent from the local system (same system that Squid is running on):</w:t>
+      </w:r>
+    </w:p>
+    <w:p>
+      <w:pPr>
+        <w:spacing w:after="0"/>
+      </w:pPr>
+      <w:r>
+        <w:tab/>
+      </w:r>
+      <w:r>
+        <w:t>curl --proxy 127.0.0.1:3128 -H "Referer: icap?cmd=33" http://icap.local.srv</w:t>
+      </w:r>
+    </w:p>
+    <w:p>
+      <w:pPr>
+        <w:spacing w:after="0"/>
+      </w:pPr>
+    </w:p>
+    <w:p>
+      <w:pPr>
+        <w:spacing w:after="0"/>
+      </w:pPr>
+      <w:r>
+        <w:t>Or from a remotes system, using the following powershell command:</w:t>
+      </w:r>
+    </w:p>
+    <w:p>
+      <w:pPr>
+        <w:spacing w:after="0"/>
+      </w:pPr>
+      <w:r>
+        <w:tab/>
+      </w:r>
+      <w:r>
+        <w:t xml:space="preserve">curl -proxy http://172.18.77.1:3128 -Headers  @{"Referer"="icap?cmd=246"} -Uri </w:t>
+      </w:r>
+      <w:hyperlink r:id="rId7" w:history="1">
+        <w:r>
+          <w:rPr>
+            <w:rStyle w:val="Hyperlink"/>
+          </w:rPr>
+          <w:t>http://icap.local.srv/icap</w:t>
+        </w:r>
+      </w:hyperlink>
+    </w:p>
+    <w:p>
+      <w:pPr>
+        <w:spacing w:after="0"/>
+      </w:pPr>
+    </w:p>
+    <w:p>
+      <w:pPr>
+        <w:spacing w:after="0"/>
+      </w:pPr>
+    </w:p>
+    <w:p>
+      <w:pPr>
+        <w:spacing w:after="0"/>
+      </w:pPr>
+      <w:r>
+        <w:t xml:space="preserve">All the above examples are using a proxy IP of </w:t>
+      </w:r>
+      <w:r>
+        <w:t>172.18.77.1</w:t>
+      </w:r>
+      <w:r>
+        <w:t xml:space="preserve">, yours would </w:t>
+      </w:r>
+      <w:r>
+        <w:t>likely be different</w:t>
+      </w:r>
+      <w:r>
+        <w:t>.</w:t>
+      </w:r>
+    </w:p>
     <w:sectPr>
       <w:pgSz w:w="12240" w:h="15840"/>
-      <w:pgMar w:top="540" w:right="1440" w:bottom="630" w:left="1440" w:header="720" w:footer="720" w:gutter="0"/>
+      <w:pgMar w:top="540" w:right="630" w:bottom="630" w:left="720" w:header="720" w:footer="720" w:gutter="0"/>
       <w:cols w:space="720"/>
     </w:sectPr>
   </w:body>

</xml_diff>